<commit_message>
Update paper: minor refinements
</commit_message>
<xml_diff>
--- a/docs/HBALS_paper.docx
+++ b/docs/HBALS_paper.docx
@@ -196,16 +196,7 @@
     </w:p>
     <w:p>
       <w:r>
-        <w:t xml:space="preserve">Beyond the growing importance of the Bees Algorithm in solving complex routing problems, recent studies have shown that combining it with local search operators can play a significant role in improving solution quality. Among the most effective of these operators are 2-opt and </w:t>
-      </w:r>
-      <w:r>
-        <w:t>Lightweight 3-opt-style refinement</w:t>
-      </w:r>
-      <w:r>
-        <w:t xml:space="preserve">, which are widely used to refine initial tours and reduce TSP cycle length. </w:t>
-      </w:r>
-      <w:r>
-        <w:t>Previous studies have investigated the use of local-search operators such as 2-opt in Bees-Algorithm-based approaches for TSP improvement</w:t>
+        <w:t>Beyond the growing importance of the Bees Algorithm in solving complex routing problems, combining it with local-search operators is a common way to improve solution quality. Operators such as 2-opt and 3-opt are widely used to refine TSP tours and reduce tour length. HBALS uses 2-opt together with a lightweight 3-opt-style refinement rather than a full 3-opt neighborhood</w:t>
       </w:r>
       <w:r>
         <w:t>.</w:t>
@@ -247,12 +238,12 @@
     </w:p>
     <w:p>
       <w:r>
+        <w:t>In another study, Sahin (2023) proposed a hybrid approach combining the Bees Algorithm with the Nearest Neighbor method to improve the quality of the initial solution. This combination accelerated convergence and reduced performance variance across several TSP instances [3].</w:t>
+      </w:r>
+    </w:p>
+    <w:p>
+      <w:r>
         <w:lastRenderedPageBreak/>
-        <w:t>In another study, Sahin (2023) proposed a hybrid approach combining the Bees Algorithm with the Nearest Neighbor method to improve the quality of the initial solution. This combination accelerated convergence and reduced performance variance across several TSP instances [3].</w:t>
-      </w:r>
-    </w:p>
-    <w:p>
-      <w:r>
         <w:t xml:space="preserve">Similarly, </w:t>
       </w:r>
       <w:proofErr w:type="spellStart"/>
@@ -316,11 +307,7 @@
     </w:p>
     <w:p>
       <w:r>
-        <w:t xml:space="preserve">The Bees Algorithm is a population-based metaheuristic developed for solving both continuous and combinatorial optimization problems. It is inspired by the natural foraging behavior of honeybees searching for nectar, and it simulates the process of locating food sources and sharing information among bees within the hive [5, 6]. It belongs to the broader family of Swarm </w:t>
-      </w:r>
-      <w:r>
-        <w:lastRenderedPageBreak/>
-        <w:t>Intelligence algorithms, which draw inspiration from the collective behavior of organisms in nature.</w:t>
+        <w:t>The Bees Algorithm is a population-based metaheuristic developed for solving both continuous and combinatorial optimization problems. It is inspired by the natural foraging behavior of honeybees searching for nectar, and it simulates the process of locating food sources and sharing information among bees within the hive [5, 6]. It belongs to the broader family of Swarm Intelligence algorithms, which draw inspiration from the collective behavior of organisms in nature.</w:t>
       </w:r>
     </w:p>
     <w:p>
@@ -328,6 +315,7 @@
         <w:pStyle w:val="Heading2"/>
       </w:pPr>
       <w:r>
+        <w:lastRenderedPageBreak/>
         <w:t>3.2 Natural Bee Foraging Behavior</w:t>
       </w:r>
     </w:p>
@@ -506,7 +494,6 @@
     </w:p>
     <w:p>
       <w:r>
-        <w:lastRenderedPageBreak/>
         <w:t>The objective is to find a permutation of the cities that minimizes the total length of the closed tour:</w:t>
       </w:r>
     </w:p>
@@ -517,6 +504,7 @@
             <w:rPr>
               <w:rFonts w:ascii="Cambria Math" w:hAnsi="Cambria Math"/>
             </w:rPr>
+            <w:lastRenderedPageBreak/>
             <m:t>L</m:t>
           </m:r>
           <m:d>
@@ -878,7 +866,6 @@
         <w:pStyle w:val="Heading2"/>
       </w:pPr>
       <w:r>
-        <w:lastRenderedPageBreak/>
         <w:t xml:space="preserve">5.1 </w:t>
       </w:r>
       <w:r>
@@ -902,6 +889,7 @@
     </w:p>
     <w:p>
       <w:r>
+        <w:lastRenderedPageBreak/>
         <w:t xml:space="preserve">An initial population of </w:t>
       </w:r>
       <m:oMath>
@@ -944,15 +932,7 @@
         <w:t xml:space="preserve"> </w:t>
       </w:r>
       <w:r>
-        <w:t xml:space="preserve">tours </w:t>
-      </w:r>
-      <w:proofErr w:type="gramStart"/>
-      <w:r>
-        <w:t>is</w:t>
-      </w:r>
-      <w:proofErr w:type="gramEnd"/>
-      <w:r>
-        <w:t xml:space="preserve"> generated using a mixture of Nearest-Neighbor and random construction. With </w:t>
+        <w:t xml:space="preserve">tours is generated using a mixture of Nearest-Neighbor and random construction. With </w:t>
       </w:r>
       <m:oMath>
         <m:r>
@@ -1356,7 +1336,6 @@
           <w:b/>
           <w:bCs/>
         </w:rPr>
-        <w:lastRenderedPageBreak/>
         <w:t>Algorithm 1. Pseudocode of HBALS for the TSP</w:t>
       </w:r>
     </w:p>
@@ -1411,6 +1390,7 @@
                 <w:sz w:val="16"/>
                 <w:szCs w:val="16"/>
               </w:rPr>
+              <w:lastRenderedPageBreak/>
               <w:t xml:space="preserve">    TSP distance matrix D</w:t>
             </w:r>
           </w:p>
@@ -2024,53 +2004,101 @@
                 <w:sz w:val="16"/>
                 <w:szCs w:val="16"/>
               </w:rPr>
-              <w:t xml:space="preserve"> ← </w:t>
-            </w:r>
-            <w:proofErr w:type="gramStart"/>
+              <w:t xml:space="preserve"> ← min(int(</w:t>
+            </w:r>
+            <w:proofErr w:type="spellStart"/>
             <w:r>
               <w:rPr>
                 <w:rFonts w:ascii="Courier New" w:hAnsi="Courier New" w:cs="Courier New"/>
                 <w:sz w:val="16"/>
                 <w:szCs w:val="16"/>
               </w:rPr>
-              <w:t>min(int(</w:t>
-            </w:r>
-            <w:proofErr w:type="spellStart"/>
-            <w:proofErr w:type="gramEnd"/>
+              <w:t>current_ngh</w:t>
+            </w:r>
+            <w:proofErr w:type="spellEnd"/>
             <w:r>
               <w:rPr>
                 <w:rFonts w:ascii="Courier New" w:hAnsi="Courier New" w:cs="Courier New"/>
                 <w:sz w:val="16"/>
                 <w:szCs w:val="16"/>
               </w:rPr>
-              <w:t>current_ngh</w:t>
-            </w:r>
-            <w:proofErr w:type="spellEnd"/>
-            <w:r>
+              <w:t xml:space="preserve"> × β), floor(N / 2))</w:t>
+            </w:r>
+          </w:p>
+          <w:p>
+            <w:pPr>
+              <w:spacing w:line="240" w:lineRule="auto"/>
+              <w:ind w:firstLine="0"/>
+              <w:jc w:val="left"/>
               <w:rPr>
                 <w:rFonts w:ascii="Courier New" w:hAnsi="Courier New" w:cs="Courier New"/>
                 <w:sz w:val="16"/>
                 <w:szCs w:val="16"/>
               </w:rPr>
-              <w:t xml:space="preserve"> × β), </w:t>
-            </w:r>
-            <w:proofErr w:type="gramStart"/>
+            </w:pPr>
             <w:r>
               <w:rPr>
                 <w:rFonts w:ascii="Courier New" w:hAnsi="Courier New" w:cs="Courier New"/>
                 <w:sz w:val="16"/>
                 <w:szCs w:val="16"/>
               </w:rPr>
-              <w:t>floor(</w:t>
-            </w:r>
-            <w:proofErr w:type="gramEnd"/>
-            <w:r>
+              <w:t>9:      else</w:t>
+            </w:r>
+          </w:p>
+          <w:p>
+            <w:pPr>
+              <w:spacing w:line="240" w:lineRule="auto"/>
+              <w:ind w:firstLine="0"/>
+              <w:jc w:val="left"/>
               <w:rPr>
                 <w:rFonts w:ascii="Courier New" w:hAnsi="Courier New" w:cs="Courier New"/>
                 <w:sz w:val="16"/>
                 <w:szCs w:val="16"/>
               </w:rPr>
-              <w:t>N / 2))</w:t>
+            </w:pPr>
+            <w:r>
+              <w:rPr>
+                <w:rFonts w:ascii="Courier New" w:hAnsi="Courier New" w:cs="Courier New"/>
+                <w:sz w:val="16"/>
+                <w:szCs w:val="16"/>
+              </w:rPr>
+              <w:t xml:space="preserve">10:         </w:t>
+            </w:r>
+            <w:proofErr w:type="spellStart"/>
+            <w:r>
+              <w:rPr>
+                <w:rFonts w:ascii="Courier New" w:hAnsi="Courier New" w:cs="Courier New"/>
+                <w:sz w:val="16"/>
+                <w:szCs w:val="16"/>
+              </w:rPr>
+              <w:t>current_ngh</w:t>
+            </w:r>
+            <w:proofErr w:type="spellEnd"/>
+            <w:r>
+              <w:rPr>
+                <w:rFonts w:ascii="Courier New" w:hAnsi="Courier New" w:cs="Courier New"/>
+                <w:sz w:val="16"/>
+                <w:szCs w:val="16"/>
+              </w:rPr>
+              <w:t xml:space="preserve"> ← max(int(</w:t>
+            </w:r>
+            <w:proofErr w:type="spellStart"/>
+            <w:r>
+              <w:rPr>
+                <w:rFonts w:ascii="Courier New" w:hAnsi="Courier New" w:cs="Courier New"/>
+                <w:sz w:val="16"/>
+                <w:szCs w:val="16"/>
+              </w:rPr>
+              <w:t>current_ngh</w:t>
+            </w:r>
+            <w:proofErr w:type="spellEnd"/>
+            <w:r>
+              <w:rPr>
+                <w:rFonts w:ascii="Courier New" w:hAnsi="Courier New" w:cs="Courier New"/>
+                <w:sz w:val="16"/>
+                <w:szCs w:val="16"/>
+              </w:rPr>
+              <w:t xml:space="preserve"> × α), 1)</w:t>
             </w:r>
           </w:p>
           <w:p>
@@ -2090,7 +2118,7 @@
                 <w:sz w:val="16"/>
                 <w:szCs w:val="16"/>
               </w:rPr>
-              <w:t>9:      else</w:t>
+              <w:t>11:     end if</w:t>
             </w:r>
           </w:p>
           <w:p>
@@ -2104,59 +2132,65 @@
                 <w:szCs w:val="16"/>
               </w:rPr>
             </w:pPr>
-            <w:r>
+          </w:p>
+          <w:p>
+            <w:pPr>
+              <w:spacing w:line="240" w:lineRule="auto"/>
+              <w:ind w:firstLine="0"/>
+              <w:jc w:val="left"/>
               <w:rPr>
                 <w:rFonts w:ascii="Courier New" w:hAnsi="Courier New" w:cs="Courier New"/>
                 <w:sz w:val="16"/>
                 <w:szCs w:val="16"/>
               </w:rPr>
-              <w:t xml:space="preserve">10:         </w:t>
-            </w:r>
-            <w:proofErr w:type="spellStart"/>
+            </w:pPr>
             <w:r>
               <w:rPr>
                 <w:rFonts w:ascii="Courier New" w:hAnsi="Courier New" w:cs="Courier New"/>
                 <w:sz w:val="16"/>
                 <w:szCs w:val="16"/>
               </w:rPr>
-              <w:t>current_ngh</w:t>
-            </w:r>
-            <w:proofErr w:type="spellEnd"/>
-            <w:r>
+              <w:t>12:     Rank all solutions according to tour length</w:t>
+            </w:r>
+          </w:p>
+          <w:p>
+            <w:pPr>
+              <w:spacing w:line="240" w:lineRule="auto"/>
+              <w:ind w:firstLine="0"/>
+              <w:jc w:val="left"/>
               <w:rPr>
                 <w:rFonts w:ascii="Courier New" w:hAnsi="Courier New" w:cs="Courier New"/>
                 <w:sz w:val="16"/>
                 <w:szCs w:val="16"/>
               </w:rPr>
-              <w:t xml:space="preserve"> ← </w:t>
-            </w:r>
-            <w:proofErr w:type="gramStart"/>
+            </w:pPr>
             <w:r>
               <w:rPr>
                 <w:rFonts w:ascii="Courier New" w:hAnsi="Courier New" w:cs="Courier New"/>
                 <w:sz w:val="16"/>
                 <w:szCs w:val="16"/>
               </w:rPr>
-              <w:t>max(int(</w:t>
-            </w:r>
-            <w:proofErr w:type="spellStart"/>
-            <w:proofErr w:type="gramEnd"/>
-            <w:r>
+              <w:t>13:     Select the best e solutions as elite sites</w:t>
+            </w:r>
+          </w:p>
+          <w:p>
+            <w:pPr>
+              <w:spacing w:line="240" w:lineRule="auto"/>
+              <w:ind w:firstLine="0"/>
+              <w:jc w:val="left"/>
               <w:rPr>
                 <w:rFonts w:ascii="Courier New" w:hAnsi="Courier New" w:cs="Courier New"/>
                 <w:sz w:val="16"/>
                 <w:szCs w:val="16"/>
               </w:rPr>
-              <w:t>current_ngh</w:t>
-            </w:r>
-            <w:proofErr w:type="spellEnd"/>
+            </w:pPr>
             <w:r>
               <w:rPr>
                 <w:rFonts w:ascii="Courier New" w:hAnsi="Courier New" w:cs="Courier New"/>
                 <w:sz w:val="16"/>
                 <w:szCs w:val="16"/>
               </w:rPr>
-              <w:t xml:space="preserve"> × α), 1)</w:t>
+              <w:t>14:     Select the best m solutions as selected sites</w:t>
             </w:r>
           </w:p>
           <w:p>
@@ -2170,13 +2204,25 @@
                 <w:szCs w:val="16"/>
               </w:rPr>
             </w:pPr>
-            <w:r>
+          </w:p>
+          <w:p>
+            <w:pPr>
+              <w:spacing w:line="240" w:lineRule="auto"/>
+              <w:ind w:firstLine="0"/>
+              <w:jc w:val="left"/>
               <w:rPr>
                 <w:rFonts w:ascii="Courier New" w:hAnsi="Courier New" w:cs="Courier New"/>
                 <w:sz w:val="16"/>
                 <w:szCs w:val="16"/>
               </w:rPr>
-              <w:t>11:     end if</w:t>
+            </w:pPr>
+            <w:r>
+              <w:rPr>
+                <w:rFonts w:ascii="Courier New" w:hAnsi="Courier New" w:cs="Courier New"/>
+                <w:sz w:val="16"/>
+                <w:szCs w:val="16"/>
+              </w:rPr>
+              <w:t>15:     for each elite site do</w:t>
             </w:r>
           </w:p>
           <w:p>
@@ -2190,6 +2236,14 @@
                 <w:szCs w:val="16"/>
               </w:rPr>
             </w:pPr>
+            <w:r>
+              <w:rPr>
+                <w:rFonts w:ascii="Courier New" w:hAnsi="Courier New" w:cs="Courier New"/>
+                <w:sz w:val="16"/>
+                <w:szCs w:val="16"/>
+              </w:rPr>
+              <w:t>16:         Generate nep candidate solutions around the elite site</w:t>
+            </w:r>
           </w:p>
           <w:p>
             <w:pPr>
@@ -2208,7 +2262,25 @@
                 <w:sz w:val="16"/>
                 <w:szCs w:val="16"/>
               </w:rPr>
-              <w:t>12:     Rank all solutions according to tour length</w:t>
+              <w:t xml:space="preserve">17:         Apply </w:t>
+            </w:r>
+            <w:proofErr w:type="spellStart"/>
+            <w:r>
+              <w:rPr>
+                <w:rFonts w:ascii="Courier New" w:hAnsi="Courier New" w:cs="Courier New"/>
+                <w:sz w:val="16"/>
+                <w:szCs w:val="16"/>
+              </w:rPr>
+              <w:t>current_ngh</w:t>
+            </w:r>
+            <w:proofErr w:type="spellEnd"/>
+            <w:r>
+              <w:rPr>
+                <w:rFonts w:ascii="Courier New" w:hAnsi="Courier New" w:cs="Courier New"/>
+                <w:sz w:val="16"/>
+                <w:szCs w:val="16"/>
+              </w:rPr>
+              <w:t xml:space="preserve"> random-swap perturbations</w:t>
             </w:r>
           </w:p>
           <w:p>
@@ -2228,7 +2300,7 @@
                 <w:sz w:val="16"/>
                 <w:szCs w:val="16"/>
               </w:rPr>
-              <w:t>13:     Select the best e solutions as elite sites</w:t>
+              <w:t>18:         Apply 2-opt with probability 0.7</w:t>
             </w:r>
           </w:p>
           <w:p>
@@ -2248,7 +2320,7 @@
                 <w:sz w:val="16"/>
                 <w:szCs w:val="16"/>
               </w:rPr>
-              <w:t>14:     Select the best m solutions as selected sites</w:t>
+              <w:t>19:         Apply lightweight 3-opt-style refinement with probability 0.1</w:t>
             </w:r>
           </w:p>
           <w:p>
@@ -2262,6 +2334,14 @@
                 <w:szCs w:val="16"/>
               </w:rPr>
             </w:pPr>
+            <w:r>
+              <w:rPr>
+                <w:rFonts w:ascii="Courier New" w:hAnsi="Courier New" w:cs="Courier New"/>
+                <w:sz w:val="16"/>
+                <w:szCs w:val="16"/>
+              </w:rPr>
+              <w:t>20:     end for</w:t>
+            </w:r>
           </w:p>
           <w:p>
             <w:pPr>
@@ -2274,163 +2354,24 @@
                 <w:szCs w:val="16"/>
               </w:rPr>
             </w:pPr>
-            <w:r>
+          </w:p>
+          <w:p>
+            <w:pPr>
+              <w:spacing w:line="240" w:lineRule="auto"/>
+              <w:ind w:firstLine="0"/>
+              <w:jc w:val="left"/>
               <w:rPr>
                 <w:rFonts w:ascii="Courier New" w:hAnsi="Courier New" w:cs="Courier New"/>
                 <w:sz w:val="16"/>
                 <w:szCs w:val="16"/>
               </w:rPr>
-              <w:t>15:     for each elite site do</w:t>
-            </w:r>
-          </w:p>
-          <w:p>
-            <w:pPr>
-              <w:spacing w:line="240" w:lineRule="auto"/>
-              <w:ind w:firstLine="0"/>
-              <w:jc w:val="left"/>
+            </w:pPr>
+            <w:r>
               <w:rPr>
                 <w:rFonts w:ascii="Courier New" w:hAnsi="Courier New" w:cs="Courier New"/>
                 <w:sz w:val="16"/>
                 <w:szCs w:val="16"/>
               </w:rPr>
-            </w:pPr>
-            <w:r>
-              <w:rPr>
-                <w:rFonts w:ascii="Courier New" w:hAnsi="Courier New" w:cs="Courier New"/>
-                <w:sz w:val="16"/>
-                <w:szCs w:val="16"/>
-              </w:rPr>
-              <w:t>16:         Generate nep candidate solutions around the elite site</w:t>
-            </w:r>
-          </w:p>
-          <w:p>
-            <w:pPr>
-              <w:spacing w:line="240" w:lineRule="auto"/>
-              <w:ind w:firstLine="0"/>
-              <w:jc w:val="left"/>
-              <w:rPr>
-                <w:rFonts w:ascii="Courier New" w:hAnsi="Courier New" w:cs="Courier New"/>
-                <w:sz w:val="16"/>
-                <w:szCs w:val="16"/>
-              </w:rPr>
-            </w:pPr>
-            <w:r>
-              <w:rPr>
-                <w:rFonts w:ascii="Courier New" w:hAnsi="Courier New" w:cs="Courier New"/>
-                <w:sz w:val="16"/>
-                <w:szCs w:val="16"/>
-              </w:rPr>
-              <w:t xml:space="preserve">17:         Apply </w:t>
-            </w:r>
-            <w:proofErr w:type="spellStart"/>
-            <w:r>
-              <w:rPr>
-                <w:rFonts w:ascii="Courier New" w:hAnsi="Courier New" w:cs="Courier New"/>
-                <w:sz w:val="16"/>
-                <w:szCs w:val="16"/>
-              </w:rPr>
-              <w:t>current_ngh</w:t>
-            </w:r>
-            <w:proofErr w:type="spellEnd"/>
-            <w:r>
-              <w:rPr>
-                <w:rFonts w:ascii="Courier New" w:hAnsi="Courier New" w:cs="Courier New"/>
-                <w:sz w:val="16"/>
-                <w:szCs w:val="16"/>
-              </w:rPr>
-              <w:t xml:space="preserve"> random-swap perturbations</w:t>
-            </w:r>
-          </w:p>
-          <w:p>
-            <w:pPr>
-              <w:spacing w:line="240" w:lineRule="auto"/>
-              <w:ind w:firstLine="0"/>
-              <w:jc w:val="left"/>
-              <w:rPr>
-                <w:rFonts w:ascii="Courier New" w:hAnsi="Courier New" w:cs="Courier New"/>
-                <w:sz w:val="16"/>
-                <w:szCs w:val="16"/>
-              </w:rPr>
-            </w:pPr>
-            <w:r>
-              <w:rPr>
-                <w:rFonts w:ascii="Courier New" w:hAnsi="Courier New" w:cs="Courier New"/>
-                <w:sz w:val="16"/>
-                <w:szCs w:val="16"/>
-              </w:rPr>
-              <w:t>18:         Apply 2-opt with probability 0.7</w:t>
-            </w:r>
-          </w:p>
-          <w:p>
-            <w:pPr>
-              <w:spacing w:line="240" w:lineRule="auto"/>
-              <w:ind w:firstLine="0"/>
-              <w:jc w:val="left"/>
-              <w:rPr>
-                <w:rFonts w:ascii="Courier New" w:hAnsi="Courier New" w:cs="Courier New"/>
-                <w:sz w:val="16"/>
-                <w:szCs w:val="16"/>
-              </w:rPr>
-            </w:pPr>
-            <w:r>
-              <w:rPr>
-                <w:rFonts w:ascii="Courier New" w:hAnsi="Courier New" w:cs="Courier New"/>
-                <w:sz w:val="16"/>
-                <w:szCs w:val="16"/>
-              </w:rPr>
-              <w:t>19:         Apply lightweight 3-opt-style refinement with probability 0.1</w:t>
-            </w:r>
-          </w:p>
-          <w:p>
-            <w:pPr>
-              <w:spacing w:line="240" w:lineRule="auto"/>
-              <w:ind w:firstLine="0"/>
-              <w:jc w:val="left"/>
-              <w:rPr>
-                <w:rFonts w:ascii="Courier New" w:hAnsi="Courier New" w:cs="Courier New"/>
-                <w:sz w:val="16"/>
-                <w:szCs w:val="16"/>
-              </w:rPr>
-            </w:pPr>
-            <w:r>
-              <w:rPr>
-                <w:rFonts w:ascii="Courier New" w:hAnsi="Courier New" w:cs="Courier New"/>
-                <w:sz w:val="16"/>
-                <w:szCs w:val="16"/>
-              </w:rPr>
-              <w:t>20:     end for</w:t>
-            </w:r>
-          </w:p>
-          <w:p>
-            <w:pPr>
-              <w:spacing w:line="240" w:lineRule="auto"/>
-              <w:ind w:firstLine="0"/>
-              <w:jc w:val="left"/>
-              <w:rPr>
-                <w:rFonts w:ascii="Courier New" w:hAnsi="Courier New" w:cs="Courier New"/>
-                <w:sz w:val="16"/>
-                <w:szCs w:val="16"/>
-              </w:rPr>
-            </w:pPr>
-          </w:p>
-          <w:p>
-            <w:pPr>
-              <w:spacing w:line="240" w:lineRule="auto"/>
-              <w:ind w:firstLine="0"/>
-              <w:jc w:val="left"/>
-              <w:rPr>
-                <w:rFonts w:ascii="Courier New" w:hAnsi="Courier New" w:cs="Courier New"/>
-                <w:sz w:val="16"/>
-                <w:szCs w:val="16"/>
-              </w:rPr>
-            </w:pPr>
-            <w:r>
-              <w:rPr>
-                <w:rFonts w:ascii="Courier New" w:hAnsi="Courier New" w:cs="Courier New"/>
-                <w:sz w:val="16"/>
-                <w:szCs w:val="16"/>
-              </w:rPr>
-              <w:lastRenderedPageBreak/>
               <w:t>21:     for each non-elite selected site do</w:t>
             </w:r>
           </w:p>
@@ -2497,37 +2438,10 @@
                 <w:sz w:val="16"/>
                 <w:szCs w:val="16"/>
               </w:rPr>
-              <w:t xml:space="preserve">23:         Apply </w:t>
-            </w:r>
-            <w:proofErr w:type="gramStart"/>
-            <w:r>
-              <w:rPr>
-                <w:rFonts w:ascii="Courier New" w:hAnsi="Courier New" w:cs="Courier New"/>
-                <w:sz w:val="16"/>
-                <w:szCs w:val="16"/>
-              </w:rPr>
-              <w:t>max(</w:t>
-            </w:r>
-            <w:proofErr w:type="gramEnd"/>
-            <w:r>
-              <w:rPr>
-                <w:rFonts w:ascii="Courier New" w:hAnsi="Courier New" w:cs="Courier New"/>
-                <w:sz w:val="16"/>
-                <w:szCs w:val="16"/>
-              </w:rPr>
-              <w:t xml:space="preserve">1, </w:t>
-            </w:r>
-            <w:proofErr w:type="gramStart"/>
-            <w:r>
-              <w:rPr>
-                <w:rFonts w:ascii="Courier New" w:hAnsi="Courier New" w:cs="Courier New"/>
-                <w:sz w:val="16"/>
-                <w:szCs w:val="16"/>
-              </w:rPr>
-              <w:t>floor(</w:t>
+              <w:lastRenderedPageBreak/>
+              <w:t>23:         Apply max(1, floor(</w:t>
             </w:r>
             <w:proofErr w:type="spellStart"/>
-            <w:proofErr w:type="gramEnd"/>
             <w:r>
               <w:rPr>
                 <w:rFonts w:ascii="Courier New" w:hAnsi="Courier New" w:cs="Courier New"/>
@@ -2732,25 +2646,7 @@
                 <w:sz w:val="16"/>
                 <w:szCs w:val="16"/>
               </w:rPr>
-              <w:t xml:space="preserve">29:     if the new best solution improves the global </w:t>
-            </w:r>
-            <w:proofErr w:type="gramStart"/>
-            <w:r>
-              <w:rPr>
-                <w:rFonts w:ascii="Courier New" w:hAnsi="Courier New" w:cs="Courier New"/>
-                <w:sz w:val="16"/>
-                <w:szCs w:val="16"/>
-              </w:rPr>
-              <w:t>best</w:t>
-            </w:r>
-            <w:proofErr w:type="gramEnd"/>
-            <w:r>
-              <w:rPr>
-                <w:rFonts w:ascii="Courier New" w:hAnsi="Courier New" w:cs="Courier New"/>
-                <w:sz w:val="16"/>
-                <w:szCs w:val="16"/>
-              </w:rPr>
-              <w:t xml:space="preserve"> then</w:t>
+              <w:t>29:     if the new best solution improves the global best then</w:t>
             </w:r>
           </w:p>
           <w:p>
@@ -3121,7 +3017,6 @@
         <w:pStyle w:val="CAPTIONS"/>
       </w:pPr>
       <w:r>
-        <w:lastRenderedPageBreak/>
         <w:t>Table 1. Selected parameters and configuration of the HBALS fast preset</w:t>
       </w:r>
     </w:p>
@@ -3176,6 +3071,7 @@
                 <w:b/>
                 <w:bCs/>
               </w:rPr>
+              <w:lastRenderedPageBreak/>
               <w:t>Parameter</w:t>
             </w:r>
           </w:p>
@@ -4129,7 +4025,6 @@
         <w:pStyle w:val="Heading2"/>
       </w:pPr>
       <w:r>
-        <w:lastRenderedPageBreak/>
         <w:t>6.4 HBALS Performance Results</w:t>
       </w:r>
     </w:p>
@@ -4197,6 +4092,7 @@
                 <w:b/>
                 <w:bCs/>
               </w:rPr>
+              <w:lastRenderedPageBreak/>
               <w:t>Dataset</w:t>
             </w:r>
           </w:p>
@@ -6109,7 +6005,6 @@
           <w:sz w:val="20"/>
           <w:szCs w:val="20"/>
         </w:rPr>
-        <w:lastRenderedPageBreak/>
         <w:t>Note:</w:t>
       </w:r>
       <w:r>
@@ -6160,6 +6055,7 @@
     </w:p>
     <w:p>
       <w:r>
+        <w:lastRenderedPageBreak/>
         <w:t>The baseline methods were not configured with identical internal parameters because each algorithm uses a different search mechanism. Instead, the experiments used the parameter configurations implemented in the accompanying repository, while keeping the number of independent runs and the maximum iteration budget consistent across methods. Therefore, the comparison evaluates the performance of the implemented configurations rather than claiming equivalence of all algorithmic computational operations.</w:t>
       </w:r>
     </w:p>
@@ -8738,7 +8634,6 @@
               <w:jc w:val="center"/>
             </w:pPr>
             <w:r>
-              <w:lastRenderedPageBreak/>
               <w:t>kroA100</w:t>
             </w:r>
           </w:p>
@@ -8995,6 +8890,7 @@
               <w:jc w:val="center"/>
             </w:pPr>
             <w:r>
+              <w:lastRenderedPageBreak/>
               <w:t>ch150</w:t>
             </w:r>
           </w:p>
@@ -10353,11 +10249,7 @@
     </w:p>
     <w:p>
       <w:r>
-        <w:t xml:space="preserve">A Friedman test was conducted on the mean tour lengths across the six benchmark instances to examine whether the five algorithms exhibited statistically different performance. The test </w:t>
-      </w:r>
-      <w:r>
-        <w:lastRenderedPageBreak/>
-        <w:t xml:space="preserve">indicated a statistically significant difference among the algorithms </w:t>
+        <w:t xml:space="preserve">A Friedman test was conducted on the mean tour lengths across the six benchmark instances to examine whether the five algorithms exhibited statistically different performance. The test indicated a statistically significant difference among the algorithms </w:t>
       </w:r>
       <m:oMath>
         <m:sSup>
@@ -10411,6 +10303,7 @@
           <w:rPr>
             <w:rFonts w:ascii="Cambria Math" w:hAnsi="Cambria Math"/>
           </w:rPr>
+          <w:lastRenderedPageBreak/>
           <m:t>p=0.009</m:t>
         </m:r>
       </m:oMath>
@@ -10550,8 +10443,11 @@
     </w:p>
     <w:p>
       <w:r>
+        <w:t xml:space="preserve">The results are consistent with the intended role of these components: Nearest-Neighbor initialization provides a set of relatively structured starting solutions, while random initialization preserves additional diversity. Elite-site search increases exploitation around promising tours, </w:t>
+      </w:r>
+      <w:r>
         <w:lastRenderedPageBreak/>
-        <w:t>The results are consistent with the intended role of these components: Nearest-Neighbor initialization provides a set of relatively structured starting solutions, while random initialization preserves additional diversity. Elite-site search increases exploitation around promising tours, whereas selected-site search provides a lighter form of exploration. The adaptive neighborhood mechanism changes the perturbation intensity according to recent progress. Because the current study evaluates the complete hybrid configuration without ablation experiments, the individual contribution of these components cannot be isolated</w:t>
+        <w:t>whereas selected-site search provides a lighter form of exploration. The adaptive neighborhood mechanism changes the perturbation intensity according to recent progress. Because the current study evaluates the complete hybrid configuration without ablation experiments, the individual contribution of these components cannot be isolated</w:t>
       </w:r>
       <w:r>
         <w:t>.</w:t>
@@ -10766,7 +10662,6 @@
         <w:pStyle w:val="Heading2"/>
       </w:pPr>
       <w:r>
-        <w:lastRenderedPageBreak/>
         <w:t>7.4 Stability and Convergence Analysis</w:t>
       </w:r>
     </w:p>
@@ -10780,6 +10675,7 @@
     </w:p>
     <w:p>
       <w:r>
+        <w:lastRenderedPageBreak/>
         <w:t>Across the 20 independent runs, HBALS showed relatively small standard deviations on the tested instances. This indicates limited variation in the best solution quality obtained across runs. However, the observed stability is specific to the selected benchmark instances and parameter configuration and should not be generalized beyond the present experiments</w:t>
       </w:r>
       <w:r>
@@ -13935,11 +13831,7 @@
       </w:r>
       <w:proofErr w:type="spellEnd"/>
       <w:r>
-        <w:t xml:space="preserve"> et al. (2024) [2] reported a </w:t>
-      </w:r>
-      <w:r>
-        <w:lastRenderedPageBreak/>
-        <w:t>mean gap of 3.46%. HBALS therefore provides a competitive result but does not achieve the best reported performance for this instance</w:t>
+        <w:t xml:space="preserve"> et al. (2024) [2] reported a mean gap of 3.46%. HBALS therefore provides a competitive result but does not achieve the best reported performance for this instance</w:t>
       </w:r>
       <w:r>
         <w:t>.</w:t>
@@ -13962,6 +13854,7 @@
     </w:p>
     <w:p>
       <w:r>
+        <w:lastRenderedPageBreak/>
         <w:t xml:space="preserve">On ch150, HBALS obtained a best value of 6570 and a mean value of 6627.95, corresponding to a mean gap of 1.53% from the BKS of 6528. Sahin (2023) [3] reported a best value of 6552 and a mean value of 6554, both of which are closer to the BKS. </w:t>
       </w:r>
       <w:proofErr w:type="spellStart"/>
@@ -14042,11 +13935,14 @@
     </w:p>
     <w:p>
       <w:r>
+        <w:t xml:space="preserve">Under the experimental configuration used in this study, HBALS reached the best-known solution on eil51, berlin52, and st70 and produced solutions within 2.25% of the BKS in terms of mean tour length on the tested instances. </w:t>
+      </w:r>
+      <w:r>
+        <w:t xml:space="preserve">HBALS also obtained lower best-tour lengths than the implemented BA, ACO, GA, and PSO baselines on all six instances. Relative to the implemented BA baseline, the reduction in best-tour length ranged from 15.3% to 68.0%, with an arithmetic </w:t>
+      </w:r>
+      <w:r>
         <w:lastRenderedPageBreak/>
-        <w:t xml:space="preserve">Under the experimental configuration used in this study, HBALS reached the best-known solution on eil51, berlin52, and st70 and produced solutions within 2.25% of the BKS in terms of mean tour length on the tested instances. </w:t>
-      </w:r>
-      <w:r>
-        <w:t>HBALS also obtained lower best-tour lengths than the implemented BA, ACO, GA, and PSO baselines on all six instances. Relative to the implemented BA baseline, the reduction in best-tour length ranged from 15.3% to 68.0%, with an arithmetic mean reduction of 41.5% across the six instances</w:t>
+        <w:t>mean reduction of 41.5% across the six instances</w:t>
       </w:r>
       <w:r>
         <w:t xml:space="preserve">. A Friedman test indicated statistically significant differences among the five tested algorithm configurations </w:t>
@@ -14304,17 +14200,17 @@
     </w:p>
     <w:p>
       <w:r>
+        <w:t>Developing lower-complexity, higher-speed variants for large-scale TSP: using lighter local search or fast approximate variants to increase convergence speed.</w:t>
+      </w:r>
+    </w:p>
+    <w:p>
+      <w:r>
+        <w:t>Employing parallel and distributed versions of the algorithm: running the algorithm on multi-core processors or GPUs to increase efficiency on very large instances.</w:t>
+      </w:r>
+    </w:p>
+    <w:p>
+      <w:r>
         <w:lastRenderedPageBreak/>
-        <w:t>Developing lower-complexity, higher-speed variants for large-scale TSP: using lighter local search or fast approximate variants to increase convergence speed.</w:t>
-      </w:r>
-    </w:p>
-    <w:p>
-      <w:r>
-        <w:t>Employing parallel and distributed versions of the algorithm: running the algorithm on multi-core processors or GPUs to increase efficiency on very large instances.</w:t>
-      </w:r>
-    </w:p>
-    <w:p>
-      <w:r>
         <w:t>Combining BA with other algorithms such as PSO, GA, or ACO: building new hybrid variants that simultaneously leverage the advantages of multiple swarm-intelligence algorithms.</w:t>
       </w:r>
     </w:p>
@@ -14897,15 +14793,7 @@
         <w:ind w:left="284" w:hanging="284"/>
       </w:pPr>
       <w:r>
-        <w:t xml:space="preserve">[3] Sahin, M. Solving TSP by using combinatorial </w:t>
-      </w:r>
-      <w:proofErr w:type="gramStart"/>
-      <w:r>
-        <w:t>Bees</w:t>
-      </w:r>
-      <w:proofErr w:type="gramEnd"/>
-      <w:r>
-        <w:t xml:space="preserve"> algorithm with nearest neighbor method. Neural </w:t>
+        <w:t xml:space="preserve">[3] Sahin, M. Solving TSP by using combinatorial Bees algorithm with nearest neighbor method. Neural </w:t>
       </w:r>
       <w:proofErr w:type="spellStart"/>
       <w:r>
@@ -14994,15 +14882,7 @@
         <w:t xml:space="preserve">[6] </w:t>
       </w:r>
       <w:r>
-        <w:t xml:space="preserve">Ismail, A. H. (2021). Enhancing the </w:t>
-      </w:r>
-      <w:proofErr w:type="gramStart"/>
-      <w:r>
-        <w:t>bees</w:t>
-      </w:r>
-      <w:proofErr w:type="gramEnd"/>
-      <w:r>
-        <w:t xml:space="preserve"> algorithm using the </w:t>
+        <w:t xml:space="preserve">Ismail, A. H. (2021). Enhancing the bees algorithm using the </w:t>
       </w:r>
       <w:proofErr w:type="spellStart"/>
       <w:r>
@@ -15252,15 +15132,7 @@
       </w:r>
       <w:proofErr w:type="spellEnd"/>
       <w:r>
-        <w:t xml:space="preserve">, O. (2023). A new local search for the </w:t>
-      </w:r>
-      <w:proofErr w:type="gramStart"/>
-      <w:r>
-        <w:t>bees</w:t>
-      </w:r>
-      <w:proofErr w:type="gramEnd"/>
-      <w:r>
-        <w:t xml:space="preserve"> algorithm to optimize multiple traveling salesman problem. Intelligent Systems with Applications, 18, 200242. </w:t>
+        <w:t xml:space="preserve">, O. (2023). A new local search for the bees algorithm to optimize multiple traveling salesman problem. Intelligent Systems with Applications, 18, 200242. </w:t>
       </w:r>
       <w:hyperlink r:id="rId26" w:history="1">
         <w:r>

</xml_diff>